<commit_message>
docs: generate Review 2.docx, Project_Report.docx, and NeuroLearn_AI_Project_Report.docx with full Phase 4 updates
</commit_message>
<xml_diff>
--- a/Review 2.docx
+++ b/Review 2.docx
@@ -164,7 +164,7 @@
                 <w:rFonts w:ascii="Calibri" w:hAnsi="Calibri"/>
                 <w:sz w:val="19"/>
               </w:rPr>
-              <w:t>Data Structures &amp; Algorithms (38 Curricular Concepts, Levels 1 to 6)</w:t>
+              <w:t>Data Structures &amp; Algorithms (38 Curricular Concepts, Levels 1 to 5)</w:t>
             </w:r>
           </w:p>
         </w:tc>
@@ -216,7 +216,7 @@
                 <w:rFonts w:ascii="Calibri" w:hAnsi="Calibri"/>
                 <w:sz w:val="19"/>
               </w:rPr>
-              <w:t>Review 2 (Phase 0, Phase 1, Phase 2, and Phase 3 Complete)</w:t>
+              <w:t>Review 2 (Phases 0, 1, 2, 3, and 4 Complete)</w:t>
             </w:r>
           </w:p>
         </w:tc>
@@ -268,7 +268,7 @@
                 <w:rFonts w:ascii="Calibri" w:hAnsi="Calibri"/>
                 <w:sz w:val="19"/>
               </w:rPr>
-              <w:t>Release v0.3 (Branch: main)</w:t>
+              <w:t>Release v0.4 (Branch: main)</w:t>
             </w:r>
           </w:p>
         </w:tc>

</xml_diff>